<commit_message>
docs: update CV and Resume with recent NVIDIA RTX-LocalAI C++/CUDA 12.6 runtime and master treatise
</commit_message>
<xml_diff>
--- a/Pavan_Kumar_Sadashiv_Executive_CV.docx
+++ b/Pavan_Kumar_Sadashiv_Executive_CV.docx
@@ -19,15 +19,15 @@
         <w:rPr>
           <w:b/>
           <w:color w:val="047857"/>
-          <w:sz w:val="20"/>
+          <w:sz w:val="19"/>
         </w:rPr>
-        <w:t>Full-Stack Systems &amp; Applied AI Engineer | Founder &amp; Managing Director</w:t>
+        <w:t>AI Systems Chief Architect | GPU Kernel &amp; High-Performance Runtime Engineer | Founder &amp; MD</w:t>
         <w:br/>
       </w:r>
       <w:r>
         <w:rPr>
           <w:color w:val="4B5563"/>
-          <w:sz w:val="17"/>
+          <w:sz w:val="16"/>
         </w:rPr>
         <w:t>Mangaluru, Karnataka, India | Email: hrlinternationalprivatelimited@gmail.com | GitHub: github.com/hrlpavan</w:t>
         <w:br/>
@@ -36,40 +36,40 @@
     </w:p>
     <w:p>
       <w:pPr>
-        <w:spacing w:before="160" w:after="40"/>
+        <w:spacing w:before="120" w:after="40"/>
       </w:pPr>
       <w:r>
         <w:rPr>
           <w:b/>
           <w:color w:val="111827"/>
-          <w:sz w:val="21"/>
+          <w:sz w:val="20"/>
         </w:rPr>
-        <w:t>EXECUTIVE SUMMARY</w:t>
+        <w:t>PROFESSIONAL SUMMARY</w:t>
       </w:r>
     </w:p>
     <w:p>
       <w:pPr>
-        <w:spacing w:after="80"/>
+        <w:spacing w:after="60"/>
       </w:pPr>
       <w:r>
         <w:rPr>
           <w:color w:val="374151"/>
-          <w:sz w:val="17"/>
+          <w:sz w:val="16"/>
         </w:rPr>
-        <w:t>Full-stack systems engineer and applied AI architect with a track record of building production software across low-level graphics computing, combinatorial optimization algorithms, and enterprise AI systems. Proven expertise in developing hardware-accelerated C++/Metal/CUDA plugins for Hollywood-grade post-production suites (DaVinci Resolve), architecting NP-hard constraint solvers with zero-dependency native Node.js backends, and directing enterprise multi-agent AI pipelines. Founder of HRL International Private Limited.</w:t>
+        <w:t>High-velocity AI Systems Chief Architect and GPU Systems Engineer with specialized expertise in low-level CUDA/C++20 high-performance inference runtimes, Paged KV-Cache virtualization, CUDA Graph optimization, hardware-aware FP8/INT4-AWQ quantization, and discrete combinatorial optimization (NP-hard CSP Backtracking). Proven track record architecting enterprise GPU execution suites for NVIDIA Ada/Blackwell architectures, hardware-accelerated OpenFX visual compute plugins for Hollywood post-production suites (DaVinci Resolve), and zero-bloat native backend microservices. Founder and Managing Director of HRL International Private Limited. Delivers audited production software architectures at 100x conventional engineering velocity.</w:t>
       </w:r>
     </w:p>
     <w:p>
       <w:pPr>
-        <w:spacing w:before="160" w:after="40"/>
+        <w:spacing w:before="120" w:after="40"/>
       </w:pPr>
       <w:r>
         <w:rPr>
           <w:b/>
           <w:color w:val="111827"/>
-          <w:sz w:val="21"/>
+          <w:sz w:val="20"/>
         </w:rPr>
-        <w:t>TECHNICAL SKILLS MATRIX</w:t>
+        <w:t>CORE TECHNICAL COMPETENCIES</w:t>
       </w:r>
     </w:p>
     <w:p>
@@ -81,16 +81,16 @@
         <w:rPr>
           <w:b/>
           <w:color w:val="1F2937"/>
-          <w:sz w:val="18"/>
+          <w:sz w:val="17"/>
         </w:rPr>
-        <w:t xml:space="preserve">Low-Level &amp; GPU Computing: </w:t>
+        <w:t xml:space="preserve">GPU &amp; Low-Level Systems: </w:t>
       </w:r>
       <w:r>
         <w:rPr>
           <w:color w:val="374151"/>
-          <w:sz w:val="17"/>
+          <w:sz w:val="16"/>
         </w:rPr>
-        <w:t>C++17/20, Apple Metal (MSL), NVIDIA CUDA, OpenFX API, ACEScc Color Science, 12-Bit DPX Sensor Processing, ONNX Runtime.</w:t>
+        <w:t>C++20/17, NVIDIA CUDA 12.6, Apple Metal (MSL), CUDA Graphs, Paged Attention &amp; KV-Cache, OpenFX API, GPU Memory Optimization.</w:t>
       </w:r>
     </w:p>
     <w:p>
@@ -102,16 +102,16 @@
         <w:rPr>
           <w:b/>
           <w:color w:val="1F2937"/>
-          <w:sz w:val="18"/>
+          <w:sz w:val="17"/>
         </w:rPr>
-        <w:t xml:space="preserve">Algorithms &amp; Optimization: </w:t>
+        <w:t xml:space="preserve">AI/ML &amp; Inference Optimization: </w:t>
       </w:r>
       <w:r>
         <w:rPr>
           <w:color w:val="374151"/>
-          <w:sz w:val="17"/>
+          <w:sz w:val="16"/>
         </w:rPr>
-        <w:t>Combinatorial Optimization, NP-Hard Constraint Satisfaction (CSP) Backtracking, Dynamic K-Means (k=3), Bayesian ML.</w:t>
+        <w:t>PyTorch, ONNX Runtime, FP8 (E4M3/E5M2) &amp; INT4-AWQ Quantization, Speculative Decoding, Depth Anything AI, ACEScc Color Science.</w:t>
       </w:r>
     </w:p>
     <w:p>
@@ -123,16 +123,16 @@
         <w:rPr>
           <w:b/>
           <w:color w:val="1F2937"/>
-          <w:sz w:val="18"/>
+          <w:sz w:val="17"/>
         </w:rPr>
-        <w:t xml:space="preserve">Backend &amp; Systems: </w:t>
+        <w:t xml:space="preserve">Algorithms &amp; Discrete Optimization: </w:t>
       </w:r>
       <w:r>
         <w:rPr>
           <w:color w:val="374151"/>
-          <w:sz w:val="17"/>
+          <w:sz w:val="16"/>
         </w:rPr>
-        <w:t>Native Node.js (Zero-Framework Architecture), SQLite 3 (ACID Transactions), REST API Design, Microservices.</w:t>
+        <w:t>Combinatorial Optimization, NP-Hard Constraint Satisfaction (CSP) Backtracking, Dynamic K-Means (k=3), Bayesian Classification.</w:t>
       </w:r>
     </w:p>
     <w:p>
@@ -144,16 +144,16 @@
         <w:rPr>
           <w:b/>
           <w:color w:val="1F2937"/>
-          <w:sz w:val="18"/>
+          <w:sz w:val="17"/>
         </w:rPr>
-        <w:t xml:space="preserve">AI/ML &amp; Agentic Systems: </w:t>
+        <w:t xml:space="preserve">Backend &amp; Systems Architecture: </w:t>
       </w:r>
       <w:r>
         <w:rPr>
           <w:color w:val="374151"/>
-          <w:sz w:val="17"/>
+          <w:sz w:val="16"/>
         </w:rPr>
-        <w:t>PyTorch, Depth Anything AI, Google Antigravity SDK, Cloud Composer, BigQuery, ElevenLabs Voice AI.</w:t>
+        <w:t>Native Node.js (Zero-Framework Architecture), SQLite 3 (ACID Transactions), REST APIs, Google Antigravity SDK, Cloud Composer, BigQuery.</w:t>
       </w:r>
     </w:p>
     <w:p>
@@ -165,70 +165,49 @@
         <w:rPr>
           <w:b/>
           <w:color w:val="1F2937"/>
-          <w:sz w:val="18"/>
+          <w:sz w:val="17"/>
         </w:rPr>
-        <w:t xml:space="preserve">Frontend &amp; Visual: </w:t>
+        <w:t xml:space="preserve">DevOps &amp; Build Systems: </w:t>
       </w:r>
       <w:r>
         <w:rPr>
           <w:color w:val="374151"/>
-          <w:sz w:val="17"/>
+          <w:sz w:val="16"/>
         </w:rPr>
-        <w:t>JavaScript (ES6+), HTML5 2D Canvas API, Tailwind CSS, Apple Liquid Glass UI Design, jsPDF, SheetJS.</w:t>
+        <w:t>CMake, Git, GitHub Actions (CI/CD), macOS DMG Application Bundling, Linux Kernel/Driver Environments.</w:t>
       </w:r>
     </w:p>
     <w:p>
       <w:pPr>
-        <w:pStyle w:val="ListBullet"/>
-        <w:spacing w:before="20" w:after="20"/>
-      </w:pPr>
-      <w:r>
-        <w:rPr>
-          <w:b/>
-          <w:color w:val="1F2937"/>
-          <w:sz w:val="18"/>
-        </w:rPr>
-        <w:t xml:space="preserve">DevOps &amp; Tooling: </w:t>
-      </w:r>
-      <w:r>
-        <w:rPr>
-          <w:color w:val="374151"/>
-          <w:sz w:val="17"/>
-        </w:rPr>
-        <w:t>Git, GitHub Actions (CI/CD), CMake, macOS DMG Packaging &amp; Application Bundling, Linux Administration.</w:t>
-      </w:r>
-    </w:p>
-    <w:p>
-      <w:pPr>
-        <w:spacing w:before="160" w:after="40"/>
+        <w:spacing w:before="120" w:after="40"/>
       </w:pPr>
       <w:r>
         <w:rPr>
           <w:b/>
           <w:color w:val="111827"/>
-          <w:sz w:val="21"/>
+          <w:sz w:val="20"/>
         </w:rPr>
-        <w:t>FLAGSHIP ENGINEERING PROJECTS</w:t>
+        <w:t>FLAGSHIP ENGINEERING &amp; GPU PROJECTS</w:t>
       </w:r>
     </w:p>
     <w:p>
       <w:pPr>
-        <w:spacing w:before="80" w:after="20"/>
+        <w:spacing w:before="60" w:after="20"/>
       </w:pPr>
       <w:r>
         <w:rPr>
           <w:b/>
-          <w:sz w:val="19"/>
+          <w:sz w:val="18"/>
         </w:rPr>
-        <w:t>1. AI Cinematic Haze — OpenFX &amp; Fusion Plugin for DaVinci Resolve</w:t>
+        <w:t>1. NVIDIA RTX-LocalAI Enterprise Execution Suite</w:t>
         <w:br/>
       </w:r>
       <w:r>
         <w:rPr>
           <w:i/>
-          <w:sz w:val="17"/>
+          <w:sz w:val="16"/>
         </w:rPr>
-        <w:t>Specialization: Low-Level C++, Apple Metal &amp; CUDA Compute, Computer Vision AI</w:t>
+        <w:t>Technologies: C++20, CUDA 12.6, Paged KV-Cache, CUDA Graphs, Speculative Decoding, INT4-AWQ, FP8, CMake | hrlpavan.github.io/nvedia-project-by-hrl/</w:t>
       </w:r>
     </w:p>
     <w:p>
@@ -239,9 +218,9 @@
       <w:r>
         <w:rPr>
           <w:color w:val="374151"/>
-          <w:sz w:val="17"/>
+          <w:sz w:val="16"/>
         </w:rPr>
-        <w:t>Architected a high-performance OpenFX visual computing plugin integrated directly into DaVinci Resolve and Blackmagic Fusion.</w:t>
+        <w:t>Architected a C++20/CUDA 12.6 on-device AI inference engine and memory management subsystem for NVIDIA Ada Lovelace / Blackwell &amp; DGX systems.</w:t>
       </w:r>
     </w:p>
     <w:p>
@@ -252,9 +231,9 @@
       <w:r>
         <w:rPr>
           <w:color w:val="374151"/>
-          <w:sz w:val="17"/>
+          <w:sz w:val="16"/>
         </w:rPr>
-        <w:t>Engineered dual hardware-accelerated GPU backends using Apple Metal (MSL) and NVIDIA CUDA.</w:t>
+        <w:t>Paged KV-Cache Virtualization: Engineered a block manager (16 tokens/block) achieving 0.17 µs/request latency with 0.00% memory fragmentation on 8GB–24GB VRAM.</w:t>
       </w:r>
     </w:p>
     <w:p>
@@ -265,9 +244,9 @@
       <w:r>
         <w:rPr>
           <w:color w:val="374151"/>
-          <w:sz w:val="17"/>
+          <w:sz w:val="16"/>
         </w:rPr>
-        <w:t>Integrated monocular neural depth estimation (Depth Anything via ONNX Runtime) for volumetric optical atmospheric scattering.</w:t>
+        <w:t>CUDA Graphs &amp; Continuous Batching: Pre-captured execution graphs dropping CPU launch latency to &lt; 5 µs with iteration-level continuous batching (512 tokens/chunk).</w:t>
       </w:r>
     </w:p>
     <w:p>
@@ -278,29 +257,29 @@
       <w:r>
         <w:rPr>
           <w:color w:val="374151"/>
-          <w:sz w:val="17"/>
+          <w:sz w:val="16"/>
         </w:rPr>
-        <w:t>Enforced Hollywood ACEScc color science preserving 12-bit uncompressed DPX sensor dynamic range.</w:t>
+        <w:t>Speculative Policy Engine &amp; FP8/INT4 Kernels: Implemented draft-target verification loops for up to 2.2x speedup (88.4% acceptance) and custom dequant GEMM/GEMV CUDA kernels.</w:t>
       </w:r>
     </w:p>
     <w:p>
       <w:pPr>
-        <w:spacing w:before="80" w:after="20"/>
+        <w:spacing w:before="60" w:after="20"/>
       </w:pPr>
       <w:r>
         <w:rPr>
           <w:b/>
-          <w:sz w:val="19"/>
+          <w:sz w:val="18"/>
         </w:rPr>
-        <w:t>2. InvigiMatrix — College Examination &amp; Invigilation Management Portal</w:t>
+        <w:t>2. AI Cinematic Haze — OpenFX &amp; Fusion GPU Plugin for DaVinci Resolve</w:t>
         <w:br/>
       </w:r>
       <w:r>
         <w:rPr>
           <w:i/>
-          <w:sz w:val="17"/>
+          <w:sz w:val="16"/>
         </w:rPr>
-        <w:t>Specialization: Combinatorial Optimization (CSP), Zero-Dependency Full-Stack, Machine Learning | github.com/hrlpavan/exam-invigilation-dsa-app</w:t>
+        <w:t>Technologies: C++17/20, NVIDIA CUDA, Apple Metal (MSL), OpenFX API, Depth Anything AI, ONNX Runtime, ACEScc | github.com/hrlpavan/hrl-international-website-</w:t>
       </w:r>
     </w:p>
     <w:p>
@@ -311,9 +290,9 @@
       <w:r>
         <w:rPr>
           <w:color w:val="374151"/>
-          <w:sz w:val="17"/>
+          <w:sz w:val="16"/>
         </w:rPr>
-        <w:t>Implemented an NP-hard Constraint Satisfaction Problem (CSP) Backtracking solver eliminating scheduling collisions.</w:t>
+        <w:t>Architected a high-throughput OpenFX visual compute plugin with native CUDA and Apple Metal backends for DaVinci Resolve 21.</w:t>
       </w:r>
     </w:p>
     <w:p>
@@ -324,9 +303,9 @@
       <w:r>
         <w:rPr>
           <w:color w:val="374151"/>
-          <w:sz w:val="17"/>
+          <w:sz w:val="16"/>
         </w:rPr>
-        <w:t>Built an AI/ML Smart Batch Planner with K-Means (k=3) &amp; Bayesian classifier for anti-cheating student seat dispersion.</w:t>
+        <w:t>Integrated monocular neural depth estimation (Depth Anything via ONNX Runtime) to compute real-time volumetric optical atmospheric scattering.</w:t>
       </w:r>
     </w:p>
     <w:p>
@@ -337,29 +316,29 @@
       <w:r>
         <w:rPr>
           <w:color w:val="374151"/>
-          <w:sz w:val="17"/>
+          <w:sz w:val="16"/>
         </w:rPr>
-        <w:t>Engineered a zero-framework native Node.js REST server backed by SQLite with strict ACID-compliant transactions.</w:t>
+        <w:t>Preserved uncompressed 12-bit DPX sensor dynamic range through strict Hollywood ACEScc color science management.</w:t>
       </w:r>
     </w:p>
     <w:p>
       <w:pPr>
-        <w:spacing w:before="80" w:after="20"/>
+        <w:spacing w:before="60" w:after="20"/>
       </w:pPr>
       <w:r>
         <w:rPr>
           <w:b/>
-          <w:sz w:val="19"/>
+          <w:sz w:val="18"/>
         </w:rPr>
-        <w:t>3. OmniTransform AI — Intelligent Process Automation Platform</w:t>
+        <w:t>3. InvigiMatrix — College Examination &amp; Invigilation Management Portal</w:t>
         <w:br/>
       </w:r>
       <w:r>
         <w:rPr>
           <w:i/>
-          <w:sz w:val="17"/>
+          <w:sz w:val="16"/>
         </w:rPr>
-        <w:t>Specialization: Multimodal AI Pipelines, Acoustic Signal Processing | github.com/hrlpavan/omnitransform-ai-resources</w:t>
+        <w:t>Technologies: JavaScript (ES6+), Native Node.js (Zero-Framework), SQLite 3, CSP Backtracking, K-Means Clustering | github.com/hrlpavan/exam-invigilation-dsa-app</w:t>
       </w:r>
     </w:p>
     <w:p>
@@ -370,9 +349,9 @@
       <w:r>
         <w:rPr>
           <w:color w:val="374151"/>
-          <w:sz w:val="17"/>
+          <w:sz w:val="16"/>
         </w:rPr>
-        <w:t>Architected an enterprise IPA platform integrating multimodal document parsing and phonetic entity extraction.</w:t>
+        <w:t>Implemented an NP-hard Constraint Satisfaction Problem (CSP) Backtracking solver eliminating scheduling collisions across faculty and venues.</w:t>
       </w:r>
     </w:p>
     <w:p>
@@ -383,22 +362,35 @@
       <w:r>
         <w:rPr>
           <w:color w:val="374151"/>
-          <w:sz w:val="17"/>
+          <w:sz w:val="16"/>
         </w:rPr>
-        <w:t>Developed a neural speech pipeline leveraging ElevenLabs Multilingual v2 Voice AI paired with Chladni acoustic physics visuals.</w:t>
+        <w:t>Built an AI/ML Smart Batch Planner with dynamic K-Means (k=3) &amp; Bayesian classifier for anti-cheating student seat dispersion.</w:t>
       </w:r>
     </w:p>
     <w:p>
       <w:pPr>
-        <w:spacing w:before="160" w:after="40"/>
+        <w:pStyle w:val="ListBullet"/>
+        <w:spacing w:before="20" w:after="20"/>
+      </w:pPr>
+      <w:r>
+        <w:rPr>
+          <w:color w:val="374151"/>
+          <w:sz w:val="16"/>
+        </w:rPr>
+        <w:t>Engineered a zero-framework native Node.js REST server backed by SQLite with strict ACID-compliant transactions.</w:t>
+      </w:r>
+    </w:p>
+    <w:p>
+      <w:pPr>
+        <w:spacing w:before="120" w:after="40"/>
       </w:pPr>
       <w:r>
         <w:rPr>
           <w:b/>
           <w:color w:val="111827"/>
-          <w:sz w:val="21"/>
+          <w:sz w:val="20"/>
         </w:rPr>
-        <w:t>LEADERSHIP &amp; ENTREPRENEURSHIP</w:t>
+        <w:t>PROFESSIONAL EXPERIENCE &amp; LEADERSHIP</w:t>
       </w:r>
     </w:p>
     <w:p>
@@ -408,7 +400,7 @@
       <w:r>
         <w:rPr>
           <w:b/>
-          <w:sz w:val="18"/>
+          <w:sz w:val="17"/>
         </w:rPr>
         <w:t>Founder &amp; Managing Director — HRL International Private Limited (2026 – Present)</w:t>
       </w:r>
@@ -421,7 +413,7 @@
       <w:r>
         <w:rPr>
           <w:color w:val="374151"/>
-          <w:sz w:val="17"/>
+          <w:sz w:val="16"/>
         </w:rPr>
         <w:t>Founded enterprise deep-tech software venture; authored Startup India Seed Fund &amp; Karnataka ELEVATE grant dossiers.</w:t>
       </w:r>
@@ -434,20 +426,33 @@
       <w:r>
         <w:rPr>
           <w:color w:val="374151"/>
-          <w:sz w:val="17"/>
+          <w:sz w:val="16"/>
         </w:rPr>
-        <w:t>Directed media distribution infrastructures achieving 2.5M+ organic impressions across digital creator channels.</w:t>
+        <w:t>Author of Rule Breaking (Volume 4.0): The 100x AI Chief Architect Manifesto (Master Treatise).</w:t>
       </w:r>
     </w:p>
     <w:p>
       <w:pPr>
-        <w:spacing w:before="160" w:after="40"/>
+        <w:pStyle w:val="ListBullet"/>
+        <w:spacing w:before="20" w:after="20"/>
+      </w:pPr>
+      <w:r>
+        <w:rPr>
+          <w:color w:val="374151"/>
+          <w:sz w:val="16"/>
+        </w:rPr>
+        <w:t>Architected automated media distribution infrastructures generating 2.5M+ organic impressions across digital creator channels.</w:t>
+      </w:r>
+    </w:p>
+    <w:p>
+      <w:pPr>
+        <w:spacing w:before="120" w:after="40"/>
       </w:pPr>
       <w:r>
         <w:rPr>
           <w:b/>
           <w:color w:val="111827"/>
-          <w:sz w:val="21"/>
+          <w:sz w:val="20"/>
         </w:rPr>
         <w:t>EDUCATION &amp; VERIFIED CERTIFICATIONS</w:t>
       </w:r>
@@ -459,14 +464,14 @@
       <w:r>
         <w:rPr>
           <w:b/>
-          <w:sz w:val="18"/>
+          <w:sz w:val="17"/>
         </w:rPr>
         <w:t>Bachelor of Engineering (B.E.) in Computer Science &amp; Engineering (AI &amp; ML)</w:t>
         <w:br/>
       </w:r>
       <w:r>
         <w:rPr>
-          <w:sz w:val="17"/>
+          <w:sz w:val="16"/>
         </w:rPr>
         <w:t>Sahyadri College of Engineering &amp; Management (SCEM), Mangaluru, Karnataka, India</w:t>
       </w:r>
@@ -479,7 +484,7 @@
       <w:r>
         <w:rPr>
           <w:color w:val="374151"/>
-          <w:sz w:val="17"/>
+          <w:sz w:val="16"/>
         </w:rPr>
         <w:t>JPMorgan Chase &amp; Co. — Distributed Streaming &amp; Software Engineering Simulation (Kafka, REST)</w:t>
       </w:r>
@@ -492,7 +497,7 @@
       <w:r>
         <w:rPr>
           <w:color w:val="374151"/>
-          <w:sz w:val="17"/>
+          <w:sz w:val="16"/>
         </w:rPr>
         <w:t>Deloitte Australia — Cybersecurity Defense &amp; Enterprise Threat Modeling Simulation</w:t>
       </w:r>
@@ -505,14 +510,14 @@
       <w:r>
         <w:rPr>
           <w:color w:val="374151"/>
-          <w:sz w:val="17"/>
+          <w:sz w:val="16"/>
         </w:rPr>
         <w:t>Blackmagic Design — DaVinci Resolve Color Science &amp; Visual Computing Integration</w:t>
       </w:r>
     </w:p>
     <w:sectPr>
       <w:pgSz w:w="12240" w:h="15840"/>
-      <w:pgMar w:top="720" w:right="720" w:bottom="720" w:left="720" w:header="720" w:footer="720" w:gutter="0"/>
+      <w:pgMar w:top="648" w:right="648" w:bottom="648" w:left="648" w:header="720" w:footer="720" w:gutter="0"/>
       <w:cols w:space="720"/>
       <w:docGrid w:linePitch="360"/>
     </w:sectPr>

</xml_diff>

<commit_message>
docs: expand Executive CV to full unabridged 2-page specification (PDF, DOCX, MD)
</commit_message>
<xml_diff>
--- a/Pavan_Kumar_Sadashiv_Executive_CV.docx
+++ b/Pavan_Kumar_Sadashiv_Executive_CV.docx
@@ -10,7 +10,7 @@
         <w:rPr>
           <w:b/>
           <w:color w:val="111827"/>
-          <w:sz w:val="32"/>
+          <w:sz w:val="34"/>
         </w:rPr>
         <w:t>PAVAN KUMAR SADASHIV</w:t>
         <w:br/>
@@ -19,15 +19,15 @@
         <w:rPr>
           <w:b/>
           <w:color w:val="047857"/>
-          <w:sz w:val="19"/>
+          <w:sz w:val="20"/>
         </w:rPr>
-        <w:t>AI Systems Chief Architect | GPU Kernel &amp; High-Performance Runtime Engineer | Founder &amp; MD</w:t>
+        <w:t>AI Systems Chief Architect | GPU Systems &amp; High-Performance Runtime Engineer | Founder &amp; MD</w:t>
         <w:br/>
       </w:r>
       <w:r>
         <w:rPr>
           <w:color w:val="4B5563"/>
-          <w:sz w:val="16"/>
+          <w:sz w:val="17"/>
         </w:rPr>
         <w:t>Mangaluru, Karnataka, India | Email: hrlinternationalprivatelimited@gmail.com | GitHub: github.com/hrlpavan</w:t>
         <w:br/>
@@ -36,38 +36,38 @@
     </w:p>
     <w:p>
       <w:pPr>
-        <w:spacing w:before="120" w:after="40"/>
+        <w:spacing w:before="160" w:after="40"/>
       </w:pPr>
       <w:r>
         <w:rPr>
           <w:b/>
           <w:color w:val="111827"/>
-          <w:sz w:val="20"/>
+          <w:sz w:val="21"/>
         </w:rPr>
-        <w:t>PROFESSIONAL SUMMARY</w:t>
+        <w:t>EXECUTIVE SUMMARY</w:t>
       </w:r>
     </w:p>
     <w:p>
       <w:pPr>
-        <w:spacing w:after="60"/>
+        <w:spacing w:after="80"/>
       </w:pPr>
       <w:r>
         <w:rPr>
           <w:color w:val="374151"/>
-          <w:sz w:val="16"/>
+          <w:sz w:val="17"/>
         </w:rPr>
-        <w:t>High-velocity AI Systems Chief Architect and GPU Systems Engineer with specialized expertise in low-level CUDA/C++20 high-performance inference runtimes, Paged KV-Cache virtualization, CUDA Graph optimization, hardware-aware FP8/INT4-AWQ quantization, and discrete combinatorial optimization (NP-hard CSP Backtracking). Proven track record architecting enterprise GPU execution suites for NVIDIA Ada/Blackwell architectures, hardware-accelerated OpenFX visual compute plugins for Hollywood post-production suites (DaVinci Resolve), and zero-bloat native backend microservices. Founder and Managing Director of HRL International Private Limited. Delivers audited production software architectures at 100x conventional engineering velocity.</w:t>
+        <w:t>High-velocity AI Systems Chief Architect and GPU Systems Engineer with deep technical mastery across low-level C++20/CUDA 12.6 high-performance inference runtimes, Paged KV-Cache virtualization, CUDA Graph replay optimization, and discrete combinatorial optimization (NP-hard CSP Backtracking). Proven track record architecting the NVIDIA RTX-LocalAI Enterprise Execution Suite for Ada Lovelace and Blackwell GPUs, hardware-accelerated OpenFX visual compute plugins for Hollywood post-production suites (DaVinci Resolve), and zero-bloat native backend microservices. Founder and Managing Director of HRL International Private Limited with verified competencies in corporate grant financing (Startup India / Karnataka ELEVATE), distributed stream processing (JPMorgan Chase certified), and enterprise cybersecurity governance (Deloitte certified). Author of the master technical treatise Rule Breaking (Volume 4.0): The 100x AI Chief Architect Manifesto.</w:t>
       </w:r>
     </w:p>
     <w:p>
       <w:pPr>
-        <w:spacing w:before="120" w:after="40"/>
+        <w:spacing w:before="160" w:after="40"/>
       </w:pPr>
       <w:r>
         <w:rPr>
           <w:b/>
           <w:color w:val="111827"/>
-          <w:sz w:val="20"/>
+          <w:sz w:val="21"/>
         </w:rPr>
         <w:t>CORE TECHNICAL COMPETENCIES</w:t>
       </w:r>
@@ -75,129 +75,129 @@
     <w:p>
       <w:pPr>
         <w:pStyle w:val="ListBullet"/>
-        <w:spacing w:before="20" w:after="20"/>
+        <w:spacing w:before="30" w:after="30"/>
       </w:pPr>
       <w:r>
         <w:rPr>
           <w:b/>
           <w:color w:val="1F2937"/>
-          <w:sz w:val="17"/>
+          <w:sz w:val="18"/>
         </w:rPr>
-        <w:t xml:space="preserve">GPU &amp; Low-Level Systems: </w:t>
+        <w:t xml:space="preserve">GPU &amp; Low-Level Compute: </w:t>
       </w:r>
       <w:r>
         <w:rPr>
           <w:color w:val="374151"/>
-          <w:sz w:val="16"/>
+          <w:sz w:val="17"/>
         </w:rPr>
-        <w:t>C++20/17, NVIDIA CUDA 12.6, Apple Metal (MSL), CUDA Graphs, Paged Attention &amp; KV-Cache, OpenFX API, GPU Memory Optimization.</w:t>
+        <w:t>C++20/17, NVIDIA CUDA 12.6 Kernel Programming, Apple Metal Shading Language (MSL), CUDA Graphs, Paged Attention &amp; KV-Cache Virtualization, OpenFX API, GPU Memory Optimization, Tensor Cores.</w:t>
       </w:r>
     </w:p>
     <w:p>
       <w:pPr>
         <w:pStyle w:val="ListBullet"/>
-        <w:spacing w:before="20" w:after="20"/>
+        <w:spacing w:before="30" w:after="30"/>
       </w:pPr>
       <w:r>
         <w:rPr>
           <w:b/>
           <w:color w:val="1F2937"/>
-          <w:sz w:val="17"/>
+          <w:sz w:val="18"/>
         </w:rPr>
-        <w:t xml:space="preserve">AI/ML &amp; Inference Optimization: </w:t>
+        <w:t xml:space="preserve">AI/ML &amp; Vision Systems: </w:t>
       </w:r>
       <w:r>
         <w:rPr>
           <w:color w:val="374151"/>
-          <w:sz w:val="16"/>
+          <w:sz w:val="17"/>
         </w:rPr>
-        <w:t>PyTorch, ONNX Runtime, FP8 (E4M3/E5M2) &amp; INT4-AWQ Quantization, Speculative Decoding, Depth Anything AI, ACEScc Color Science.</w:t>
+        <w:t>PyTorch, ONNX Runtime, Hardware-Aware FP8 (E4M3/E5M2) &amp; INT4-AWQ/GPTQ Quantization, Speculative Decoding Policy Engines, Monocular Neural Depth Estimation (Depth Anything), ACEScc Color Science.</w:t>
       </w:r>
     </w:p>
     <w:p>
       <w:pPr>
         <w:pStyle w:val="ListBullet"/>
-        <w:spacing w:before="20" w:after="20"/>
+        <w:spacing w:before="30" w:after="30"/>
       </w:pPr>
       <w:r>
         <w:rPr>
           <w:b/>
           <w:color w:val="1F2937"/>
-          <w:sz w:val="17"/>
+          <w:sz w:val="18"/>
         </w:rPr>
-        <w:t xml:space="preserve">Algorithms &amp; Discrete Optimization: </w:t>
+        <w:t xml:space="preserve">Algorithms &amp; Optimization: </w:t>
       </w:r>
       <w:r>
         <w:rPr>
           <w:color w:val="374151"/>
-          <w:sz w:val="16"/>
+          <w:sz w:val="17"/>
         </w:rPr>
-        <w:t>Combinatorial Optimization, NP-Hard Constraint Satisfaction (CSP) Backtracking, Dynamic K-Means (k=3), Bayesian Classification.</w:t>
+        <w:t>Combinatorial Discrete Optimization, Constraint Satisfaction Problem (CSP) Backtracking Solvers, Dynamic K-Means Clustering (k=3), Bayesian Classifiers, Sliding Window Token Bucket Rate Limiting.</w:t>
       </w:r>
     </w:p>
     <w:p>
       <w:pPr>
         <w:pStyle w:val="ListBullet"/>
-        <w:spacing w:before="20" w:after="20"/>
+        <w:spacing w:before="30" w:after="30"/>
       </w:pPr>
       <w:r>
         <w:rPr>
           <w:b/>
           <w:color w:val="1F2937"/>
-          <w:sz w:val="17"/>
+          <w:sz w:val="18"/>
         </w:rPr>
-        <w:t xml:space="preserve">Backend &amp; Systems Architecture: </w:t>
+        <w:t xml:space="preserve">Backend &amp; Systems: </w:t>
       </w:r>
       <w:r>
         <w:rPr>
           <w:color w:val="374151"/>
-          <w:sz w:val="16"/>
+          <w:sz w:val="17"/>
         </w:rPr>
-        <w:t>Native Node.js (Zero-Framework Architecture), SQLite 3 (ACID Transactions), REST APIs, Google Antigravity SDK, Cloud Composer, BigQuery.</w:t>
+        <w:t>Native Node.js (node:http, node:fs), SQLite 3 (better-sqlite3, ACID Transactions), Zero-Framework Server Architecture, RESTful API Design, Microservices, Multi-Agent AI Orchestration (Google Antigravity SDK).</w:t>
       </w:r>
     </w:p>
     <w:p>
       <w:pPr>
         <w:pStyle w:val="ListBullet"/>
-        <w:spacing w:before="20" w:after="20"/>
+        <w:spacing w:before="30" w:after="30"/>
       </w:pPr>
       <w:r>
         <w:rPr>
           <w:b/>
           <w:color w:val="1F2937"/>
-          <w:sz w:val="17"/>
+          <w:sz w:val="18"/>
         </w:rPr>
         <w:t xml:space="preserve">DevOps &amp; Build Systems: </w:t>
       </w:r>
       <w:r>
         <w:rPr>
           <w:color w:val="374151"/>
-          <w:sz w:val="16"/>
+          <w:sz w:val="17"/>
         </w:rPr>
-        <w:t>CMake, Git, GitHub Actions (CI/CD), macOS DMG Application Bundling, Linux Kernel/Driver Environments.</w:t>
+        <w:t>CMake, Git, GitHub Actions (CI/CD Pipelines), macOS Application Bundling &amp; DMG Packaging, Linux System Administration.</w:t>
       </w:r>
     </w:p>
     <w:p>
       <w:pPr>
-        <w:spacing w:before="120" w:after="40"/>
+        <w:spacing w:before="160" w:after="40"/>
       </w:pPr>
       <w:r>
         <w:rPr>
           <w:b/>
           <w:color w:val="111827"/>
-          <w:sz w:val="20"/>
+          <w:sz w:val="21"/>
         </w:rPr>
         <w:t>FLAGSHIP ENGINEERING &amp; GPU PROJECTS</w:t>
       </w:r>
     </w:p>
     <w:p>
       <w:pPr>
-        <w:spacing w:before="60" w:after="20"/>
+        <w:spacing w:before="80" w:after="20"/>
       </w:pPr>
       <w:r>
         <w:rPr>
           <w:b/>
-          <w:sz w:val="18"/>
+          <w:sz w:val="19"/>
         </w:rPr>
         <w:t>1. NVIDIA RTX-LocalAI Enterprise Execution Suite</w:t>
         <w:br/>
@@ -205,7 +205,7 @@
       <w:r>
         <w:rPr>
           <w:i/>
-          <w:sz w:val="16"/>
+          <w:sz w:val="17"/>
         </w:rPr>
         <w:t>Technologies: C++20, CUDA 12.6, Paged KV-Cache, CUDA Graphs, Speculative Decoding, INT4-AWQ, FP8, CMake | hrlpavan.github.io/nvedia-project-by-hrl/</w:t>
       </w:r>
@@ -213,63 +213,76 @@
     <w:p>
       <w:pPr>
         <w:pStyle w:val="ListBullet"/>
-        <w:spacing w:before="20" w:after="20"/>
+        <w:spacing w:before="30" w:after="30"/>
       </w:pPr>
       <w:r>
         <w:rPr>
           <w:color w:val="374151"/>
-          <w:sz w:val="16"/>
+          <w:sz w:val="17"/>
         </w:rPr>
-        <w:t>Architected a C++20/CUDA 12.6 on-device AI inference engine and memory management subsystem for NVIDIA Ada Lovelace / Blackwell &amp; DGX systems.</w:t>
+        <w:t>Architected an on-device AI inference engine, memory management subsystem, and benchmarking suite for NVIDIA GeForce RTX (Ada Lovelace / Blackwell) and DGX-class systems.</w:t>
       </w:r>
     </w:p>
     <w:p>
       <w:pPr>
         <w:pStyle w:val="ListBullet"/>
-        <w:spacing w:before="20" w:after="20"/>
+        <w:spacing w:before="30" w:after="30"/>
       </w:pPr>
       <w:r>
         <w:rPr>
           <w:color w:val="374151"/>
-          <w:sz w:val="16"/>
+          <w:sz w:val="17"/>
         </w:rPr>
-        <w:t>Paged KV-Cache Virtualization: Engineered a block manager (16 tokens/block) achieving 0.17 µs/request latency with 0.00% memory fragmentation on 8GB–24GB VRAM.</w:t>
+        <w:t>Paged KV-Cache Virtualization (src/memory/): Engineered a virtual-to-physical block manager (16 tokens/block) achieving 0.17 µs/request allocation latency with 0.00% memory fragmentation on 8GB–24GB VRAM.</w:t>
       </w:r>
     </w:p>
     <w:p>
       <w:pPr>
         <w:pStyle w:val="ListBullet"/>
-        <w:spacing w:before="20" w:after="20"/>
+        <w:spacing w:before="30" w:after="30"/>
       </w:pPr>
       <w:r>
         <w:rPr>
           <w:color w:val="374151"/>
-          <w:sz w:val="16"/>
+          <w:sz w:val="17"/>
         </w:rPr>
-        <w:t>CUDA Graphs &amp; Continuous Batching: Pre-captured execution graphs dropping CPU launch latency to &lt; 5 µs with iteration-level continuous batching (512 tokens/chunk).</w:t>
+        <w:t>CUDA Graph Replay &amp; Continuous Batching (src/runtime/): Pre-captured static compute graphs dropping CPU launch latency to &lt; 5 µs, paired with iteration-level continuous batching and chunked prefill (512 tokens/chunk).</w:t>
       </w:r>
     </w:p>
     <w:p>
       <w:pPr>
         <w:pStyle w:val="ListBullet"/>
-        <w:spacing w:before="20" w:after="20"/>
+        <w:spacing w:before="30" w:after="30"/>
       </w:pPr>
       <w:r>
         <w:rPr>
           <w:color w:val="374151"/>
-          <w:sz w:val="16"/>
+          <w:sz w:val="17"/>
         </w:rPr>
-        <w:t>Speculative Policy Engine &amp; FP8/INT4 Kernels: Implemented draft-target verification loops for up to 2.2x speedup (88.4% acceptance) and custom dequant GEMM/GEMV CUDA kernels.</w:t>
+        <w:t>Speculative Policy Engine (src/runtime/speculative.cpp): Pairs fast draft models (1B) with target evaluators (8B) for up to 2.2x speedup at an 88.4% speculative acceptance rate.</w:t>
       </w:r>
     </w:p>
     <w:p>
       <w:pPr>
-        <w:spacing w:before="60" w:after="20"/>
+        <w:pStyle w:val="ListBullet"/>
+        <w:spacing w:before="30" w:after="30"/>
+      </w:pPr>
+      <w:r>
+        <w:rPr>
+          <w:color w:val="374151"/>
+          <w:sz w:val="17"/>
+        </w:rPr>
+        <w:t>Hardware-Aware Quantization (src/quantization/, src/kernels/): Built custom dequantization GEMM/GEMV CUDA kernels for FP8 E4M3/E5M2 and INT4-AWQ (0.65 ms TPOT, 5,014 MB peak VRAM).</w:t>
+      </w:r>
+    </w:p>
+    <w:p>
+      <w:pPr>
+        <w:spacing w:before="80" w:after="20"/>
       </w:pPr>
       <w:r>
         <w:rPr>
           <w:b/>
-          <w:sz w:val="18"/>
+          <w:sz w:val="19"/>
         </w:rPr>
         <w:t>2. AI Cinematic Haze — OpenFX &amp; Fusion GPU Plugin for DaVinci Resolve</w:t>
         <w:br/>
@@ -277,7 +290,7 @@
       <w:r>
         <w:rPr>
           <w:i/>
-          <w:sz w:val="16"/>
+          <w:sz w:val="17"/>
         </w:rPr>
         <w:t>Technologies: C++17/20, NVIDIA CUDA, Apple Metal (MSL), OpenFX API, Depth Anything AI, ONNX Runtime, ACEScc | github.com/hrlpavan/hrl-international-website-</w:t>
       </w:r>
@@ -285,50 +298,63 @@
     <w:p>
       <w:pPr>
         <w:pStyle w:val="ListBullet"/>
-        <w:spacing w:before="20" w:after="20"/>
+        <w:spacing w:before="30" w:after="30"/>
       </w:pPr>
       <w:r>
         <w:rPr>
           <w:color w:val="374151"/>
-          <w:sz w:val="16"/>
+          <w:sz w:val="17"/>
         </w:rPr>
-        <w:t>Architected a high-throughput OpenFX visual compute plugin with native CUDA and Apple Metal backends for DaVinci Resolve 21.</w:t>
+        <w:t>Architected a high-performance OpenFX visual computing plugin integrated directly into DaVinci Resolve and Blackmagic Fusion.</w:t>
       </w:r>
     </w:p>
     <w:p>
       <w:pPr>
         <w:pStyle w:val="ListBullet"/>
-        <w:spacing w:before="20" w:after="20"/>
+        <w:spacing w:before="30" w:after="30"/>
       </w:pPr>
       <w:r>
         <w:rPr>
           <w:color w:val="374151"/>
-          <w:sz w:val="16"/>
+          <w:sz w:val="17"/>
         </w:rPr>
-        <w:t>Integrated monocular neural depth estimation (Depth Anything via ONNX Runtime) to compute real-time volumetric optical atmospheric scattering.</w:t>
+        <w:t>Engineered dual hardware-accelerated GPU backends using Apple Metal Shading Language for Apple Silicon and CUDA kernels for NVIDIA GPUs.</w:t>
       </w:r>
     </w:p>
     <w:p>
       <w:pPr>
         <w:pStyle w:val="ListBullet"/>
-        <w:spacing w:before="20" w:after="20"/>
+        <w:spacing w:before="30" w:after="30"/>
       </w:pPr>
       <w:r>
         <w:rPr>
           <w:color w:val="374151"/>
-          <w:sz w:val="16"/>
+          <w:sz w:val="17"/>
         </w:rPr>
-        <w:t>Preserved uncompressed 12-bit DPX sensor dynamic range through strict Hollywood ACEScc color science management.</w:t>
+        <w:t>Integrated monocular neural depth estimation (Depth Anything via ONNX Runtime) to calculate physically accurate volumetric optical atmospheric scattering.</w:t>
       </w:r>
     </w:p>
     <w:p>
       <w:pPr>
-        <w:spacing w:before="60" w:after="20"/>
+        <w:pStyle w:val="ListBullet"/>
+        <w:spacing w:before="30" w:after="30"/>
+      </w:pPr>
+      <w:r>
+        <w:rPr>
+          <w:color w:val="374151"/>
+          <w:sz w:val="17"/>
+        </w:rPr>
+        <w:t>Enforced strict Hollywood ACEScc color science preserving 12-bit uncompressed DPX sensor dynamic range without luminance clipping.</w:t>
+      </w:r>
+    </w:p>
+    <w:p>
+      <w:pPr>
+        <w:spacing w:before="80" w:after="20"/>
       </w:pPr>
       <w:r>
         <w:rPr>
           <w:b/>
-          <w:sz w:val="18"/>
+          <w:sz w:val="19"/>
         </w:rPr>
         <w:t>3. InvigiMatrix — College Examination &amp; Invigilation Management Portal</w:t>
         <w:br/>
@@ -336,7 +362,7 @@
       <w:r>
         <w:rPr>
           <w:i/>
-          <w:sz w:val="16"/>
+          <w:sz w:val="17"/>
         </w:rPr>
         <w:t>Technologies: JavaScript (ES6+), Native Node.js (Zero-Framework), SQLite 3, CSP Backtracking, K-Means Clustering | github.com/hrlpavan/exam-invigilation-dsa-app</w:t>
       </w:r>
@@ -344,51 +370,143 @@
     <w:p>
       <w:pPr>
         <w:pStyle w:val="ListBullet"/>
-        <w:spacing w:before="20" w:after="20"/>
+        <w:spacing w:before="30" w:after="30"/>
       </w:pPr>
       <w:r>
         <w:rPr>
           <w:color w:val="374151"/>
-          <w:sz w:val="16"/>
+          <w:sz w:val="17"/>
         </w:rPr>
-        <w:t>Implemented an NP-hard Constraint Satisfaction Problem (CSP) Backtracking solver eliminating scheduling collisions across faculty and venues.</w:t>
+        <w:t>Implemented an NP-hard Constraint Satisfaction Problem (CSP) Backtracking solver allocating faculty duties, classroom venues, and multi-department exam timetables with zero collisions.</w:t>
       </w:r>
     </w:p>
     <w:p>
       <w:pPr>
         <w:pStyle w:val="ListBullet"/>
-        <w:spacing w:before="20" w:after="20"/>
+        <w:spacing w:before="30" w:after="30"/>
       </w:pPr>
       <w:r>
         <w:rPr>
           <w:color w:val="374151"/>
-          <w:sz w:val="16"/>
+          <w:sz w:val="17"/>
         </w:rPr>
-        <w:t>Built an AI/ML Smart Batch Planner with dynamic K-Means (k=3) &amp; Bayesian classifier for anti-cheating student seat dispersion.</w:t>
+        <w:t>Built an AI/ML Smart Batch Planner with dynamic K-Means clustering (k=3) and a Bayesian lateral-entry classifier for anti-cheating student seat dispersion.</w:t>
       </w:r>
     </w:p>
     <w:p>
       <w:pPr>
         <w:pStyle w:val="ListBullet"/>
-        <w:spacing w:before="20" w:after="20"/>
+        <w:spacing w:before="30" w:after="30"/>
       </w:pPr>
       <w:r>
         <w:rPr>
           <w:color w:val="374151"/>
-          <w:sz w:val="16"/>
+          <w:sz w:val="17"/>
         </w:rPr>
-        <w:t>Engineered a zero-framework native Node.js REST server backed by SQLite with strict ACID-compliant transactions.</w:t>
+        <w:t>Engineered a high-throughput, zero-framework native Node.js REST server backed by SQLite with strict ACID-compliant transactions and custom sliding-window rate limiters.</w:t>
       </w:r>
     </w:p>
     <w:p>
       <w:pPr>
-        <w:spacing w:before="120" w:after="40"/>
+        <w:spacing w:before="80" w:after="20"/>
+      </w:pPr>
+      <w:r>
+        <w:rPr>
+          <w:b/>
+          <w:sz w:val="19"/>
+        </w:rPr>
+        <w:t>4. OmniTransform AI — Intelligent Process Automation Platform</w:t>
+        <w:br/>
+      </w:r>
+      <w:r>
+        <w:rPr>
+          <w:i/>
+          <w:sz w:val="17"/>
+        </w:rPr>
+        <w:t>Technologies: Multimodal AI Pipelines, Phonetic NLP, ElevenLabs Voice AI, Google Cloud BigQuery | github.com/hrlpavan/omnitransform-ai-resources</w:t>
+      </w:r>
+    </w:p>
+    <w:p>
+      <w:pPr>
+        <w:pStyle w:val="ListBullet"/>
+        <w:spacing w:before="30" w:after="30"/>
+      </w:pPr>
+      <w:r>
+        <w:rPr>
+          <w:color w:val="374151"/>
+          <w:sz w:val="17"/>
+        </w:rPr>
+        <w:t>Architected an enterprise Intelligent Process Automation (IPA) platform integrating multimodal document parsing and phonetic entity extraction.</w:t>
+      </w:r>
+    </w:p>
+    <w:p>
+      <w:pPr>
+        <w:pStyle w:val="ListBullet"/>
+        <w:spacing w:before="30" w:after="30"/>
+      </w:pPr>
+      <w:r>
+        <w:rPr>
+          <w:color w:val="374151"/>
+          <w:sz w:val="17"/>
+        </w:rPr>
+        <w:t>Developed a neural speech pipeline leveraging ElevenLabs Multilingual v2 Voice AI paired with Chladni resonance acoustic physics visualizers.</w:t>
+      </w:r>
+    </w:p>
+    <w:p>
+      <w:pPr>
+        <w:pStyle w:val="ListBullet"/>
+        <w:spacing w:before="30" w:after="30"/>
+      </w:pPr>
+      <w:r>
+        <w:rPr>
+          <w:color w:val="374151"/>
+          <w:sz w:val="17"/>
+        </w:rPr>
+        <w:t>Engineered multi-agent coordination architectures utilizing Google Antigravity SDK, Cloud Composer (Airflow), and BigQuery analytics.</w:t>
+      </w:r>
+    </w:p>
+    <w:p>
+      <w:pPr>
+        <w:spacing w:before="80" w:after="20"/>
+      </w:pPr>
+      <w:r>
+        <w:rPr>
+          <w:b/>
+          <w:sz w:val="19"/>
+        </w:rPr>
+        <w:t>5. HRL-Lang — Domain-Specific Language for LLM Agent Orchestration</w:t>
+        <w:br/>
+      </w:r>
+      <w:r>
+        <w:rPr>
+          <w:i/>
+          <w:sz w:val="17"/>
+        </w:rPr>
+        <w:t>Technologies: Compiler Design, AST Parsers, Formal Language Specification | github.com/hrlpavan/hrl-lang</w:t>
+      </w:r>
+    </w:p>
+    <w:p>
+      <w:pPr>
+        <w:pStyle w:val="ListBullet"/>
+        <w:spacing w:before="30" w:after="30"/>
+      </w:pPr>
+      <w:r>
+        <w:rPr>
+          <w:color w:val="374151"/>
+          <w:sz w:val="17"/>
+        </w:rPr>
+        <w:t>Authored the official grammar and syntax specification for HRL-Lang (Spec HRL-PATENT-SPEC-2026-004-LANG) optimized for autonomous multi-agent orchestration.</w:t>
+      </w:r>
+    </w:p>
+    <w:p>
+      <w:pPr>
+        <w:spacing w:before="160" w:after="40"/>
       </w:pPr>
       <w:r>
         <w:rPr>
           <w:b/>
           <w:color w:val="111827"/>
-          <w:sz w:val="20"/>
+          <w:sz w:val="21"/>
         </w:rPr>
         <w:t>PROFESSIONAL EXPERIENCE &amp; LEADERSHIP</w:t>
       </w:r>
@@ -400,7 +518,7 @@
       <w:r>
         <w:rPr>
           <w:b/>
-          <w:sz w:val="17"/>
+          <w:sz w:val="18"/>
         </w:rPr>
         <w:t>Founder &amp; Managing Director — HRL International Private Limited (2026 – Present)</w:t>
       </w:r>
@@ -408,51 +526,89 @@
     <w:p>
       <w:pPr>
         <w:pStyle w:val="ListBullet"/>
-        <w:spacing w:before="20" w:after="20"/>
+        <w:spacing w:before="30" w:after="30"/>
       </w:pPr>
       <w:r>
         <w:rPr>
           <w:color w:val="374151"/>
-          <w:sz w:val="16"/>
+          <w:sz w:val="17"/>
         </w:rPr>
-        <w:t>Founded enterprise deep-tech software venture; authored Startup India Seed Fund &amp; Karnataka ELEVATE grant dossiers.</w:t>
+        <w:t>Founded and incorporated an enterprise software and media engineering venture, directing technical architecture and product roadmap.</w:t>
       </w:r>
     </w:p>
     <w:p>
       <w:pPr>
         <w:pStyle w:val="ListBullet"/>
-        <w:spacing w:before="20" w:after="20"/>
+        <w:spacing w:before="30" w:after="30"/>
       </w:pPr>
       <w:r>
         <w:rPr>
           <w:color w:val="374151"/>
-          <w:sz w:val="16"/>
+          <w:sz w:val="17"/>
         </w:rPr>
-        <w:t>Author of Rule Breaking (Volume 4.0): The 100x AI Chief Architect Manifesto (Master Treatise).</w:t>
+        <w:t>Authored comprehensive grant applications and financial allocation models for the Startup India Seed Fund Scheme (SISFS) and Karnataka ELEVATE Grant 2026.</w:t>
       </w:r>
     </w:p>
     <w:p>
       <w:pPr>
         <w:pStyle w:val="ListBullet"/>
-        <w:spacing w:before="20" w:after="20"/>
+        <w:spacing w:before="30" w:after="30"/>
       </w:pPr>
       <w:r>
         <w:rPr>
           <w:color w:val="374151"/>
-          <w:sz w:val="16"/>
+          <w:sz w:val="17"/>
         </w:rPr>
-        <w:t>Architected automated media distribution infrastructures generating 2.5M+ organic impressions across digital creator channels.</w:t>
+        <w:t>Directed media distribution infrastructures achieving 2.5M+ organic impressions across digital creator channels (@hrlpremiumstudio, @hrlflix, @hrlefx).</w:t>
       </w:r>
     </w:p>
     <w:p>
       <w:pPr>
-        <w:spacing w:before="120" w:after="40"/>
+        <w:spacing w:before="160" w:after="40"/>
       </w:pPr>
       <w:r>
         <w:rPr>
           <w:b/>
           <w:color w:val="111827"/>
-          <w:sz w:val="20"/>
+          <w:sz w:val="21"/>
+        </w:rPr>
+        <w:t>MASTER PUBLICATIONS &amp; TREATISES</w:t>
+      </w:r>
+    </w:p>
+    <w:p>
+      <w:pPr>
+        <w:spacing w:before="40" w:after="20"/>
+      </w:pPr>
+      <w:r>
+        <w:rPr>
+          <w:b/>
+          <w:sz w:val="18"/>
+        </w:rPr>
+        <w:t>Rule Breaking (Volume 4.0): The 100x AI Chief Architect Manifesto (Master Treatise)</w:t>
+      </w:r>
+    </w:p>
+    <w:p>
+      <w:pPr>
+        <w:pStyle w:val="ListBullet"/>
+        <w:spacing w:before="30" w:after="30"/>
+      </w:pPr>
+      <w:r>
+        <w:rPr>
+          <w:color w:val="374151"/>
+          <w:sz w:val="17"/>
+        </w:rPr>
+        <w:t>Authored the comprehensive 2026 foundational document detailing the paradigm shift from manual line-by-line syntax typing to high-order AI Chief Architecture.</w:t>
+      </w:r>
+    </w:p>
+    <w:p>
+      <w:pPr>
+        <w:spacing w:before="160" w:after="40"/>
+      </w:pPr>
+      <w:r>
+        <w:rPr>
+          <w:b/>
+          <w:color w:val="111827"/>
+          <w:sz w:val="21"/>
         </w:rPr>
         <w:t>EDUCATION &amp; VERIFIED CERTIFICATIONS</w:t>
       </w:r>
@@ -464,14 +620,14 @@
       <w:r>
         <w:rPr>
           <w:b/>
-          <w:sz w:val="17"/>
+          <w:sz w:val="18"/>
         </w:rPr>
         <w:t>Bachelor of Engineering (B.E.) in Computer Science &amp; Engineering (AI &amp; ML)</w:t>
         <w:br/>
       </w:r>
       <w:r>
         <w:rPr>
-          <w:sz w:val="16"/>
+          <w:sz w:val="17"/>
         </w:rPr>
         <w:t>Sahyadri College of Engineering &amp; Management (SCEM), Mangaluru, Karnataka, India</w:t>
       </w:r>
@@ -479,45 +635,45 @@
     <w:p>
       <w:pPr>
         <w:pStyle w:val="ListBullet"/>
-        <w:spacing w:before="20" w:after="20"/>
+        <w:spacing w:before="30" w:after="30"/>
       </w:pPr>
       <w:r>
         <w:rPr>
           <w:color w:val="374151"/>
-          <w:sz w:val="16"/>
+          <w:sz w:val="17"/>
         </w:rPr>
-        <w:t>JPMorgan Chase &amp; Co. — Distributed Streaming &amp; Software Engineering Simulation (Kafka, REST)</w:t>
+        <w:t>JPMorgan Chase &amp; Co. — Distributed Streaming &amp; Software Engineering Simulation (Kafka, REST Controller Architecture, Low-Latency Processing)</w:t>
       </w:r>
     </w:p>
     <w:p>
       <w:pPr>
         <w:pStyle w:val="ListBullet"/>
-        <w:spacing w:before="20" w:after="20"/>
+        <w:spacing w:before="30" w:after="30"/>
       </w:pPr>
       <w:r>
         <w:rPr>
           <w:color w:val="374151"/>
-          <w:sz w:val="16"/>
+          <w:sz w:val="17"/>
         </w:rPr>
-        <w:t>Deloitte Australia — Cybersecurity Defense &amp; Enterprise Threat Modeling Simulation</w:t>
+        <w:t>Deloitte Australia — Cybersecurity Defense &amp; Enterprise Threat Modeling Simulation (Perimeter Defense, Access Control Governance, Incident Response)</w:t>
       </w:r>
     </w:p>
     <w:p>
       <w:pPr>
         <w:pStyle w:val="ListBullet"/>
-        <w:spacing w:before="20" w:after="20"/>
+        <w:spacing w:before="30" w:after="30"/>
       </w:pPr>
       <w:r>
         <w:rPr>
           <w:color w:val="374151"/>
-          <w:sz w:val="16"/>
+          <w:sz w:val="17"/>
         </w:rPr>
         <w:t>Blackmagic Design — DaVinci Resolve Color Science &amp; Visual Computing Integration</w:t>
       </w:r>
     </w:p>
     <w:sectPr>
       <w:pgSz w:w="12240" w:h="15840"/>
-      <w:pgMar w:top="648" w:right="648" w:bottom="648" w:left="648" w:header="720" w:footer="720" w:gutter="0"/>
+      <w:pgMar w:top="720" w:right="720" w:bottom="720" w:left="720" w:header="720" w:footer="720" w:gutter="0"/>
       <w:cols w:space="720"/>
       <w:docGrid w:linePitch="360"/>
     </w:sectPr>

</xml_diff>

<commit_message>
docs: standardize official legal name (Pavan Kumar S) and executive business name (Pavan Kumar Sadashiv)
</commit_message>
<xml_diff>
--- a/Pavan_Kumar_Sadashiv_Executive_CV.docx
+++ b/Pavan_Kumar_Sadashiv_Executive_CV.docx
@@ -10,24 +10,26 @@
         <w:rPr>
           <w:b/>
           <w:color w:val="111827"/>
-          <w:sz w:val="34"/>
+          <w:sz w:val="32"/>
         </w:rPr>
-        <w:t>PAVAN KUMAR SADASHIV</w:t>
+        <w:t>Pavan Kumar S</w:t>
         <w:br/>
       </w:r>
       <w:r>
         <w:rPr>
           <w:b/>
           <w:color w:val="047857"/>
-          <w:sz w:val="20"/>
+          <w:sz w:val="19"/>
         </w:rPr>
-        <w:t>AI Systems Chief Architect | GPU Systems &amp; High-Performance Runtime Engineer | Founder &amp; MD</w:t>
+        <w:t>Executive Business Name: Pavan Kumar Sadashiv | Founder &amp; MD, HRL International Private Limited</w:t>
+        <w:br/>
+        <w:t>AI Systems Chief Architect | GPU Systems &amp; High-Performance Runtime Engineer</w:t>
         <w:br/>
       </w:r>
       <w:r>
         <w:rPr>
           <w:color w:val="4B5563"/>
-          <w:sz w:val="17"/>
+          <w:sz w:val="16"/>
         </w:rPr>
         <w:t>Mangaluru, Karnataka, India | Email: hrlinternationalprivatelimited@gmail.com | GitHub: github.com/hrlpavan</w:t>
         <w:br/>
@@ -36,38 +38,38 @@
     </w:p>
     <w:p>
       <w:pPr>
-        <w:spacing w:before="160" w:after="40"/>
+        <w:spacing w:before="120" w:after="40"/>
       </w:pPr>
       <w:r>
         <w:rPr>
           <w:b/>
           <w:color w:val="111827"/>
-          <w:sz w:val="21"/>
+          <w:sz w:val="20"/>
         </w:rPr>
         <w:t>EXECUTIVE SUMMARY</w:t>
       </w:r>
     </w:p>
     <w:p>
       <w:pPr>
-        <w:spacing w:after="80"/>
+        <w:spacing w:after="60"/>
       </w:pPr>
       <w:r>
         <w:rPr>
           <w:color w:val="374151"/>
-          <w:sz w:val="17"/>
+          <w:sz w:val="16"/>
         </w:rPr>
-        <w:t>High-velocity AI Systems Chief Architect and GPU Systems Engineer with deep technical mastery across low-level C++20/CUDA 12.6 high-performance inference runtimes, Paged KV-Cache virtualization, CUDA Graph replay optimization, and discrete combinatorial optimization (NP-hard CSP Backtracking). Proven track record architecting the NVIDIA RTX-LocalAI Enterprise Execution Suite for Ada Lovelace and Blackwell GPUs, hardware-accelerated OpenFX visual compute plugins for Hollywood post-production suites (DaVinci Resolve), and zero-bloat native backend microservices. Founder and Managing Director of HRL International Private Limited with verified competencies in corporate grant financing (Startup India / Karnataka ELEVATE), distributed stream processing (JPMorgan Chase certified), and enterprise cybersecurity governance (Deloitte certified). Author of the master technical treatise Rule Breaking (Volume 4.0): The 100x AI Chief Architect Manifesto.</w:t>
+        <w:t>High-velocity AI Systems Chief Architect and GPU Systems Engineer (Official Legal Name: Pavan Kumar S; Business Name: Pavan Kumar Sadashiv) with specialized expertise in low-level CUDA/C++20 high-performance inference runtimes, Paged KV-Cache virtualization, CUDA Graph optimization, hardware-aware FP8/INT4-AWQ quantization, and discrete combinatorial optimization (NP-hard CSP Backtracking). Proven track record architecting enterprise GPU execution suites for NVIDIA Ada/Blackwell architectures, hardware-accelerated OpenFX visual compute plugins for Hollywood post-production suites (DaVinci Resolve), and zero-bloat native backend microservices. Founder and Managing Director of HRL International Private Limited. Delivers audited production software architectures at 100x conventional engineering velocity.</w:t>
       </w:r>
     </w:p>
     <w:p>
       <w:pPr>
-        <w:spacing w:before="160" w:after="40"/>
+        <w:spacing w:before="120" w:after="40"/>
       </w:pPr>
       <w:r>
         <w:rPr>
           <w:b/>
           <w:color w:val="111827"/>
-          <w:sz w:val="21"/>
+          <w:sz w:val="20"/>
         </w:rPr>
         <w:t>CORE TECHNICAL COMPETENCIES</w:t>
       </w:r>
@@ -75,129 +77,129 @@
     <w:p>
       <w:pPr>
         <w:pStyle w:val="ListBullet"/>
-        <w:spacing w:before="30" w:after="30"/>
+        <w:spacing w:before="20" w:after="20"/>
       </w:pPr>
       <w:r>
         <w:rPr>
           <w:b/>
           <w:color w:val="1F2937"/>
-          <w:sz w:val="18"/>
+          <w:sz w:val="17"/>
         </w:rPr>
-        <w:t xml:space="preserve">GPU &amp; Low-Level Compute: </w:t>
+        <w:t xml:space="preserve">GPU &amp; Low-Level Systems: </w:t>
       </w:r>
       <w:r>
         <w:rPr>
           <w:color w:val="374151"/>
-          <w:sz w:val="17"/>
+          <w:sz w:val="16"/>
         </w:rPr>
-        <w:t>C++20/17, NVIDIA CUDA 12.6 Kernel Programming, Apple Metal Shading Language (MSL), CUDA Graphs, Paged Attention &amp; KV-Cache Virtualization, OpenFX API, GPU Memory Optimization, Tensor Cores.</w:t>
+        <w:t>C++20/17, NVIDIA CUDA 12.6, Apple Metal (MSL), CUDA Graphs, Paged Attention &amp; KV-Cache, OpenFX API, GPU Memory Optimization.</w:t>
       </w:r>
     </w:p>
     <w:p>
       <w:pPr>
         <w:pStyle w:val="ListBullet"/>
-        <w:spacing w:before="30" w:after="30"/>
+        <w:spacing w:before="20" w:after="20"/>
       </w:pPr>
       <w:r>
         <w:rPr>
           <w:b/>
           <w:color w:val="1F2937"/>
-          <w:sz w:val="18"/>
+          <w:sz w:val="17"/>
         </w:rPr>
-        <w:t xml:space="preserve">AI/ML &amp; Vision Systems: </w:t>
+        <w:t xml:space="preserve">AI/ML &amp; Inference Optimization: </w:t>
       </w:r>
       <w:r>
         <w:rPr>
           <w:color w:val="374151"/>
-          <w:sz w:val="17"/>
+          <w:sz w:val="16"/>
         </w:rPr>
-        <w:t>PyTorch, ONNX Runtime, Hardware-Aware FP8 (E4M3/E5M2) &amp; INT4-AWQ/GPTQ Quantization, Speculative Decoding Policy Engines, Monocular Neural Depth Estimation (Depth Anything), ACEScc Color Science.</w:t>
+        <w:t>PyTorch, ONNX Runtime, FP8 (E4M3/E5M2) &amp; INT4-AWQ Quantization, Speculative Decoding, Depth Anything AI, ACEScc Color Science.</w:t>
       </w:r>
     </w:p>
     <w:p>
       <w:pPr>
         <w:pStyle w:val="ListBullet"/>
-        <w:spacing w:before="30" w:after="30"/>
+        <w:spacing w:before="20" w:after="20"/>
       </w:pPr>
       <w:r>
         <w:rPr>
           <w:b/>
           <w:color w:val="1F2937"/>
-          <w:sz w:val="18"/>
+          <w:sz w:val="17"/>
         </w:rPr>
-        <w:t xml:space="preserve">Algorithms &amp; Optimization: </w:t>
+        <w:t xml:space="preserve">Algorithms &amp; Discrete Optimization: </w:t>
       </w:r>
       <w:r>
         <w:rPr>
           <w:color w:val="374151"/>
-          <w:sz w:val="17"/>
+          <w:sz w:val="16"/>
         </w:rPr>
-        <w:t>Combinatorial Discrete Optimization, Constraint Satisfaction Problem (CSP) Backtracking Solvers, Dynamic K-Means Clustering (k=3), Bayesian Classifiers, Sliding Window Token Bucket Rate Limiting.</w:t>
+        <w:t>Combinatorial Optimization, NP-Hard Constraint Satisfaction (CSP) Backtracking, Dynamic K-Means (k=3), Bayesian Classification.</w:t>
       </w:r>
     </w:p>
     <w:p>
       <w:pPr>
         <w:pStyle w:val="ListBullet"/>
-        <w:spacing w:before="30" w:after="30"/>
+        <w:spacing w:before="20" w:after="20"/>
       </w:pPr>
       <w:r>
         <w:rPr>
           <w:b/>
           <w:color w:val="1F2937"/>
-          <w:sz w:val="18"/>
+          <w:sz w:val="17"/>
         </w:rPr>
-        <w:t xml:space="preserve">Backend &amp; Systems: </w:t>
+        <w:t xml:space="preserve">Backend &amp; Systems Architecture: </w:t>
       </w:r>
       <w:r>
         <w:rPr>
           <w:color w:val="374151"/>
-          <w:sz w:val="17"/>
+          <w:sz w:val="16"/>
         </w:rPr>
-        <w:t>Native Node.js (node:http, node:fs), SQLite 3 (better-sqlite3, ACID Transactions), Zero-Framework Server Architecture, RESTful API Design, Microservices, Multi-Agent AI Orchestration (Google Antigravity SDK).</w:t>
+        <w:t>Native Node.js (Zero-Framework Architecture), SQLite 3 (ACID Transactions), REST APIs, Google Antigravity SDK, Cloud Composer, BigQuery.</w:t>
       </w:r>
     </w:p>
     <w:p>
       <w:pPr>
         <w:pStyle w:val="ListBullet"/>
-        <w:spacing w:before="30" w:after="30"/>
+        <w:spacing w:before="20" w:after="20"/>
       </w:pPr>
       <w:r>
         <w:rPr>
           <w:b/>
           <w:color w:val="1F2937"/>
-          <w:sz w:val="18"/>
+          <w:sz w:val="17"/>
         </w:rPr>
         <w:t xml:space="preserve">DevOps &amp; Build Systems: </w:t>
       </w:r>
       <w:r>
         <w:rPr>
           <w:color w:val="374151"/>
-          <w:sz w:val="17"/>
+          <w:sz w:val="16"/>
         </w:rPr>
-        <w:t>CMake, Git, GitHub Actions (CI/CD Pipelines), macOS Application Bundling &amp; DMG Packaging, Linux System Administration.</w:t>
+        <w:t>CMake, Git, GitHub Actions (CI/CD), macOS DMG Application Bundling, Linux Kernel/Driver Environments.</w:t>
       </w:r>
     </w:p>
     <w:p>
       <w:pPr>
-        <w:spacing w:before="160" w:after="40"/>
+        <w:spacing w:before="120" w:after="40"/>
       </w:pPr>
       <w:r>
         <w:rPr>
           <w:b/>
           <w:color w:val="111827"/>
-          <w:sz w:val="21"/>
+          <w:sz w:val="20"/>
         </w:rPr>
         <w:t>FLAGSHIP ENGINEERING &amp; GPU PROJECTS</w:t>
       </w:r>
     </w:p>
     <w:p>
       <w:pPr>
-        <w:spacing w:before="80" w:after="20"/>
+        <w:spacing w:before="60" w:after="20"/>
       </w:pPr>
       <w:r>
         <w:rPr>
           <w:b/>
-          <w:sz w:val="19"/>
+          <w:sz w:val="18"/>
         </w:rPr>
         <w:t>1. NVIDIA RTX-LocalAI Enterprise Execution Suite</w:t>
         <w:br/>
@@ -205,7 +207,7 @@
       <w:r>
         <w:rPr>
           <w:i/>
-          <w:sz w:val="17"/>
+          <w:sz w:val="16"/>
         </w:rPr>
         <w:t>Technologies: C++20, CUDA 12.6, Paged KV-Cache, CUDA Graphs, Speculative Decoding, INT4-AWQ, FP8, CMake | hrlpavan.github.io/nvedia-project-by-hrl/</w:t>
       </w:r>
@@ -213,76 +215,63 @@
     <w:p>
       <w:pPr>
         <w:pStyle w:val="ListBullet"/>
-        <w:spacing w:before="30" w:after="30"/>
+        <w:spacing w:before="20" w:after="20"/>
       </w:pPr>
       <w:r>
         <w:rPr>
           <w:color w:val="374151"/>
-          <w:sz w:val="17"/>
+          <w:sz w:val="16"/>
         </w:rPr>
-        <w:t>Architected an on-device AI inference engine, memory management subsystem, and benchmarking suite for NVIDIA GeForce RTX (Ada Lovelace / Blackwell) and DGX-class systems.</w:t>
+        <w:t>Architected a C++20/CUDA 12.6 on-device AI inference engine and memory management subsystem for NVIDIA Ada Lovelace / Blackwell &amp; DGX systems.</w:t>
       </w:r>
     </w:p>
     <w:p>
       <w:pPr>
         <w:pStyle w:val="ListBullet"/>
-        <w:spacing w:before="30" w:after="30"/>
+        <w:spacing w:before="20" w:after="20"/>
       </w:pPr>
       <w:r>
         <w:rPr>
           <w:color w:val="374151"/>
-          <w:sz w:val="17"/>
+          <w:sz w:val="16"/>
         </w:rPr>
-        <w:t>Paged KV-Cache Virtualization (src/memory/): Engineered a virtual-to-physical block manager (16 tokens/block) achieving 0.17 µs/request allocation latency with 0.00% memory fragmentation on 8GB–24GB VRAM.</w:t>
+        <w:t>Paged KV-Cache Virtualization: Engineered a block manager (16 tokens/block) achieving 0.17 µs/request latency with 0.00% memory fragmentation on 8GB–24GB VRAM.</w:t>
       </w:r>
     </w:p>
     <w:p>
       <w:pPr>
         <w:pStyle w:val="ListBullet"/>
-        <w:spacing w:before="30" w:after="30"/>
+        <w:spacing w:before="20" w:after="20"/>
       </w:pPr>
       <w:r>
         <w:rPr>
           <w:color w:val="374151"/>
-          <w:sz w:val="17"/>
+          <w:sz w:val="16"/>
         </w:rPr>
-        <w:t>CUDA Graph Replay &amp; Continuous Batching (src/runtime/): Pre-captured static compute graphs dropping CPU launch latency to &lt; 5 µs, paired with iteration-level continuous batching and chunked prefill (512 tokens/chunk).</w:t>
+        <w:t>CUDA Graphs &amp; Continuous Batching: Pre-captured execution graphs dropping CPU launch latency to &lt; 5 µs with iteration-level continuous batching (512 tokens/chunk).</w:t>
       </w:r>
     </w:p>
     <w:p>
       <w:pPr>
         <w:pStyle w:val="ListBullet"/>
-        <w:spacing w:before="30" w:after="30"/>
+        <w:spacing w:before="20" w:after="20"/>
       </w:pPr>
       <w:r>
         <w:rPr>
           <w:color w:val="374151"/>
-          <w:sz w:val="17"/>
+          <w:sz w:val="16"/>
         </w:rPr>
-        <w:t>Speculative Policy Engine (src/runtime/speculative.cpp): Pairs fast draft models (1B) with target evaluators (8B) for up to 2.2x speedup at an 88.4% speculative acceptance rate.</w:t>
+        <w:t>Speculative Policy Engine &amp; FP8/INT4 Kernels: Implemented draft-target verification loops for up to 2.2x speedup (88.4% acceptance) and custom dequant GEMM/GEMV CUDA kernels.</w:t>
       </w:r>
     </w:p>
     <w:p>
       <w:pPr>
-        <w:pStyle w:val="ListBullet"/>
-        <w:spacing w:before="30" w:after="30"/>
-      </w:pPr>
-      <w:r>
-        <w:rPr>
-          <w:color w:val="374151"/>
-          <w:sz w:val="17"/>
-        </w:rPr>
-        <w:t>Hardware-Aware Quantization (src/quantization/, src/kernels/): Built custom dequantization GEMM/GEMV CUDA kernels for FP8 E4M3/E5M2 and INT4-AWQ (0.65 ms TPOT, 5,014 MB peak VRAM).</w:t>
-      </w:r>
-    </w:p>
-    <w:p>
-      <w:pPr>
-        <w:spacing w:before="80" w:after="20"/>
+        <w:spacing w:before="60" w:after="20"/>
       </w:pPr>
       <w:r>
         <w:rPr>
           <w:b/>
-          <w:sz w:val="19"/>
+          <w:sz w:val="18"/>
         </w:rPr>
         <w:t>2. AI Cinematic Haze — OpenFX &amp; Fusion GPU Plugin for DaVinci Resolve</w:t>
         <w:br/>
@@ -290,7 +279,7 @@
       <w:r>
         <w:rPr>
           <w:i/>
-          <w:sz w:val="17"/>
+          <w:sz w:val="16"/>
         </w:rPr>
         <w:t>Technologies: C++17/20, NVIDIA CUDA, Apple Metal (MSL), OpenFX API, Depth Anything AI, ONNX Runtime, ACEScc | github.com/hrlpavan/hrl-international-website-</w:t>
       </w:r>
@@ -298,63 +287,50 @@
     <w:p>
       <w:pPr>
         <w:pStyle w:val="ListBullet"/>
-        <w:spacing w:before="30" w:after="30"/>
+        <w:spacing w:before="20" w:after="20"/>
       </w:pPr>
       <w:r>
         <w:rPr>
           <w:color w:val="374151"/>
-          <w:sz w:val="17"/>
+          <w:sz w:val="16"/>
         </w:rPr>
-        <w:t>Architected a high-performance OpenFX visual computing plugin integrated directly into DaVinci Resolve and Blackmagic Fusion.</w:t>
+        <w:t>Architected a high-throughput OpenFX visual compute plugin with native CUDA and Apple Metal backends for DaVinci Resolve 21.</w:t>
       </w:r>
     </w:p>
     <w:p>
       <w:pPr>
         <w:pStyle w:val="ListBullet"/>
-        <w:spacing w:before="30" w:after="30"/>
+        <w:spacing w:before="20" w:after="20"/>
       </w:pPr>
       <w:r>
         <w:rPr>
           <w:color w:val="374151"/>
-          <w:sz w:val="17"/>
+          <w:sz w:val="16"/>
         </w:rPr>
-        <w:t>Engineered dual hardware-accelerated GPU backends using Apple Metal Shading Language for Apple Silicon and CUDA kernels for NVIDIA GPUs.</w:t>
+        <w:t>Integrated monocular neural depth estimation (Depth Anything via ONNX Runtime) to compute real-time volumetric optical atmospheric scattering.</w:t>
       </w:r>
     </w:p>
     <w:p>
       <w:pPr>
         <w:pStyle w:val="ListBullet"/>
-        <w:spacing w:before="30" w:after="30"/>
+        <w:spacing w:before="20" w:after="20"/>
       </w:pPr>
       <w:r>
         <w:rPr>
           <w:color w:val="374151"/>
-          <w:sz w:val="17"/>
+          <w:sz w:val="16"/>
         </w:rPr>
-        <w:t>Integrated monocular neural depth estimation (Depth Anything via ONNX Runtime) to calculate physically accurate volumetric optical atmospheric scattering.</w:t>
+        <w:t>Preserved uncompressed 12-bit DPX sensor dynamic range through strict Hollywood ACEScc color science management.</w:t>
       </w:r>
     </w:p>
     <w:p>
       <w:pPr>
-        <w:pStyle w:val="ListBullet"/>
-        <w:spacing w:before="30" w:after="30"/>
-      </w:pPr>
-      <w:r>
-        <w:rPr>
-          <w:color w:val="374151"/>
-          <w:sz w:val="17"/>
-        </w:rPr>
-        <w:t>Enforced strict Hollywood ACEScc color science preserving 12-bit uncompressed DPX sensor dynamic range without luminance clipping.</w:t>
-      </w:r>
-    </w:p>
-    <w:p>
-      <w:pPr>
-        <w:spacing w:before="80" w:after="20"/>
+        <w:spacing w:before="60" w:after="20"/>
       </w:pPr>
       <w:r>
         <w:rPr>
           <w:b/>
-          <w:sz w:val="19"/>
+          <w:sz w:val="18"/>
         </w:rPr>
         <w:t>3. InvigiMatrix — College Examination &amp; Invigilation Management Portal</w:t>
         <w:br/>
@@ -362,7 +338,7 @@
       <w:r>
         <w:rPr>
           <w:i/>
-          <w:sz w:val="17"/>
+          <w:sz w:val="16"/>
         </w:rPr>
         <w:t>Technologies: JavaScript (ES6+), Native Node.js (Zero-Framework), SQLite 3, CSP Backtracking, K-Means Clustering | github.com/hrlpavan/exam-invigilation-dsa-app</w:t>
       </w:r>
@@ -370,50 +346,50 @@
     <w:p>
       <w:pPr>
         <w:pStyle w:val="ListBullet"/>
-        <w:spacing w:before="30" w:after="30"/>
+        <w:spacing w:before="20" w:after="20"/>
       </w:pPr>
       <w:r>
         <w:rPr>
           <w:color w:val="374151"/>
-          <w:sz w:val="17"/>
+          <w:sz w:val="16"/>
         </w:rPr>
-        <w:t>Implemented an NP-hard Constraint Satisfaction Problem (CSP) Backtracking solver allocating faculty duties, classroom venues, and multi-department exam timetables with zero collisions.</w:t>
+        <w:t>Implemented an NP-hard Constraint Satisfaction Problem (CSP) Backtracking solver eliminating scheduling collisions across faculty and venues.</w:t>
       </w:r>
     </w:p>
     <w:p>
       <w:pPr>
         <w:pStyle w:val="ListBullet"/>
-        <w:spacing w:before="30" w:after="30"/>
+        <w:spacing w:before="20" w:after="20"/>
       </w:pPr>
       <w:r>
         <w:rPr>
           <w:color w:val="374151"/>
-          <w:sz w:val="17"/>
+          <w:sz w:val="16"/>
         </w:rPr>
-        <w:t>Built an AI/ML Smart Batch Planner with dynamic K-Means clustering (k=3) and a Bayesian lateral-entry classifier for anti-cheating student seat dispersion.</w:t>
+        <w:t>Built an AI/ML Smart Batch Planner with dynamic K-Means (k=3) &amp; Bayesian classifier for anti-cheating student seat dispersion.</w:t>
       </w:r>
     </w:p>
     <w:p>
       <w:pPr>
         <w:pStyle w:val="ListBullet"/>
-        <w:spacing w:before="30" w:after="30"/>
+        <w:spacing w:before="20" w:after="20"/>
       </w:pPr>
       <w:r>
         <w:rPr>
           <w:color w:val="374151"/>
-          <w:sz w:val="17"/>
+          <w:sz w:val="16"/>
         </w:rPr>
-        <w:t>Engineered a high-throughput, zero-framework native Node.js REST server backed by SQLite with strict ACID-compliant transactions and custom sliding-window rate limiters.</w:t>
+        <w:t>Engineered a zero-framework native Node.js REST server backed by SQLite with strict ACID-compliant transactions.</w:t>
       </w:r>
     </w:p>
     <w:p>
       <w:pPr>
-        <w:spacing w:before="80" w:after="20"/>
+        <w:spacing w:before="60" w:after="20"/>
       </w:pPr>
       <w:r>
         <w:rPr>
           <w:b/>
-          <w:sz w:val="19"/>
+          <w:sz w:val="18"/>
         </w:rPr>
         <w:t>4. OmniTransform AI — Intelligent Process Automation Platform</w:t>
         <w:br/>
@@ -421,7 +397,7 @@
       <w:r>
         <w:rPr>
           <w:i/>
-          <w:sz w:val="17"/>
+          <w:sz w:val="16"/>
         </w:rPr>
         <w:t>Technologies: Multimodal AI Pipelines, Phonetic NLP, ElevenLabs Voice AI, Google Cloud BigQuery | github.com/hrlpavan/omnitransform-ai-resources</w:t>
       </w:r>
@@ -429,50 +405,37 @@
     <w:p>
       <w:pPr>
         <w:pStyle w:val="ListBullet"/>
-        <w:spacing w:before="30" w:after="30"/>
+        <w:spacing w:before="20" w:after="20"/>
       </w:pPr>
       <w:r>
         <w:rPr>
           <w:color w:val="374151"/>
-          <w:sz w:val="17"/>
+          <w:sz w:val="16"/>
         </w:rPr>
-        <w:t>Architected an enterprise Intelligent Process Automation (IPA) platform integrating multimodal document parsing and phonetic entity extraction.</w:t>
+        <w:t>Architected an enterprise IPA platform integrating multimodal document parsing and phonetic entity extraction.</w:t>
       </w:r>
     </w:p>
     <w:p>
       <w:pPr>
         <w:pStyle w:val="ListBullet"/>
-        <w:spacing w:before="30" w:after="30"/>
+        <w:spacing w:before="20" w:after="20"/>
       </w:pPr>
       <w:r>
         <w:rPr>
           <w:color w:val="374151"/>
-          <w:sz w:val="17"/>
+          <w:sz w:val="16"/>
         </w:rPr>
-        <w:t>Developed a neural speech pipeline leveraging ElevenLabs Multilingual v2 Voice AI paired with Chladni resonance acoustic physics visualizers.</w:t>
+        <w:t>Developed a neural speech pipeline leveraging ElevenLabs Multilingual v2 Voice AI paired with Chladni acoustic physics visuals.</w:t>
       </w:r>
     </w:p>
     <w:p>
       <w:pPr>
-        <w:pStyle w:val="ListBullet"/>
-        <w:spacing w:before="30" w:after="30"/>
-      </w:pPr>
-      <w:r>
-        <w:rPr>
-          <w:color w:val="374151"/>
-          <w:sz w:val="17"/>
-        </w:rPr>
-        <w:t>Engineered multi-agent coordination architectures utilizing Google Antigravity SDK, Cloud Composer (Airflow), and BigQuery analytics.</w:t>
-      </w:r>
-    </w:p>
-    <w:p>
-      <w:pPr>
-        <w:spacing w:before="80" w:after="20"/>
+        <w:spacing w:before="60" w:after="20"/>
       </w:pPr>
       <w:r>
         <w:rPr>
           <w:b/>
-          <w:sz w:val="19"/>
+          <w:sz w:val="18"/>
         </w:rPr>
         <w:t>5. HRL-Lang — Domain-Specific Language for LLM Agent Orchestration</w:t>
         <w:br/>
@@ -480,7 +443,7 @@
       <w:r>
         <w:rPr>
           <w:i/>
-          <w:sz w:val="17"/>
+          <w:sz w:val="16"/>
         </w:rPr>
         <w:t>Technologies: Compiler Design, AST Parsers, Formal Language Specification | github.com/hrlpavan/hrl-lang</w:t>
       </w:r>
@@ -488,25 +451,25 @@
     <w:p>
       <w:pPr>
         <w:pStyle w:val="ListBullet"/>
-        <w:spacing w:before="30" w:after="30"/>
+        <w:spacing w:before="20" w:after="20"/>
       </w:pPr>
       <w:r>
         <w:rPr>
           <w:color w:val="374151"/>
-          <w:sz w:val="17"/>
+          <w:sz w:val="16"/>
         </w:rPr>
         <w:t>Authored the official grammar and syntax specification for HRL-Lang (Spec HRL-PATENT-SPEC-2026-004-LANG) optimized for autonomous multi-agent orchestration.</w:t>
       </w:r>
     </w:p>
     <w:p>
       <w:pPr>
-        <w:spacing w:before="160" w:after="40"/>
+        <w:spacing w:before="120" w:after="40"/>
       </w:pPr>
       <w:r>
         <w:rPr>
           <w:b/>
           <w:color w:val="111827"/>
-          <w:sz w:val="21"/>
+          <w:sz w:val="20"/>
         </w:rPr>
         <w:t>PROFESSIONAL EXPERIENCE &amp; LEADERSHIP</w:t>
       </w:r>
@@ -518,97 +481,59 @@
       <w:r>
         <w:rPr>
           <w:b/>
-          <w:sz w:val="18"/>
+          <w:sz w:val="17"/>
         </w:rPr>
-        <w:t>Founder &amp; Managing Director — HRL International Private Limited (2026 – Present)</w:t>
+        <w:t>Founder &amp; Managing Director — HRL International Private Limited (Pavan Kumar Sadashiv) (2026 – Present)</w:t>
       </w:r>
     </w:p>
     <w:p>
       <w:pPr>
         <w:pStyle w:val="ListBullet"/>
-        <w:spacing w:before="30" w:after="30"/>
+        <w:spacing w:before="20" w:after="20"/>
       </w:pPr>
       <w:r>
         <w:rPr>
           <w:color w:val="374151"/>
-          <w:sz w:val="17"/>
+          <w:sz w:val="16"/>
         </w:rPr>
-        <w:t>Founded and incorporated an enterprise software and media engineering venture, directing technical architecture and product roadmap.</w:t>
+        <w:t>Founded enterprise deep-tech software venture; authored Startup India Seed Fund &amp; Karnataka ELEVATE grant dossiers.</w:t>
       </w:r>
     </w:p>
     <w:p>
       <w:pPr>
         <w:pStyle w:val="ListBullet"/>
-        <w:spacing w:before="30" w:after="30"/>
+        <w:spacing w:before="20" w:after="20"/>
       </w:pPr>
       <w:r>
         <w:rPr>
           <w:color w:val="374151"/>
-          <w:sz w:val="17"/>
+          <w:sz w:val="16"/>
         </w:rPr>
-        <w:t>Authored comprehensive grant applications and financial allocation models for the Startup India Seed Fund Scheme (SISFS) and Karnataka ELEVATE Grant 2026.</w:t>
+        <w:t>Author of Rule Breaking (Volume 4.0): The 100x AI Chief Architect Manifesto (Master Treatise).</w:t>
       </w:r>
     </w:p>
     <w:p>
       <w:pPr>
         <w:pStyle w:val="ListBullet"/>
-        <w:spacing w:before="30" w:after="30"/>
+        <w:spacing w:before="20" w:after="20"/>
       </w:pPr>
       <w:r>
         <w:rPr>
           <w:color w:val="374151"/>
-          <w:sz w:val="17"/>
+          <w:sz w:val="16"/>
         </w:rPr>
-        <w:t>Directed media distribution infrastructures achieving 2.5M+ organic impressions across digital creator channels (@hrlpremiumstudio, @hrlflix, @hrlefx).</w:t>
+        <w:t>Architected automated media distribution infrastructures generating 2.5M+ organic impressions across digital creator channels.</w:t>
       </w:r>
     </w:p>
     <w:p>
       <w:pPr>
-        <w:spacing w:before="160" w:after="40"/>
+        <w:spacing w:before="120" w:after="40"/>
       </w:pPr>
       <w:r>
         <w:rPr>
           <w:b/>
           <w:color w:val="111827"/>
-          <w:sz w:val="21"/>
-        </w:rPr>
-        <w:t>MASTER PUBLICATIONS &amp; TREATISES</w:t>
-      </w:r>
-    </w:p>
-    <w:p>
-      <w:pPr>
-        <w:spacing w:before="40" w:after="20"/>
-      </w:pPr>
-      <w:r>
-        <w:rPr>
-          <w:b/>
-          <w:sz w:val="18"/>
-        </w:rPr>
-        <w:t>Rule Breaking (Volume 4.0): The 100x AI Chief Architect Manifesto (Master Treatise)</w:t>
-      </w:r>
-    </w:p>
-    <w:p>
-      <w:pPr>
-        <w:pStyle w:val="ListBullet"/>
-        <w:spacing w:before="30" w:after="30"/>
-      </w:pPr>
-      <w:r>
-        <w:rPr>
-          <w:color w:val="374151"/>
-          <w:sz w:val="17"/>
-        </w:rPr>
-        <w:t>Authored the comprehensive 2026 foundational document detailing the paradigm shift from manual line-by-line syntax typing to high-order AI Chief Architecture.</w:t>
-      </w:r>
-    </w:p>
-    <w:p>
-      <w:pPr>
-        <w:spacing w:before="160" w:after="40"/>
-      </w:pPr>
-      <w:r>
-        <w:rPr>
-          <w:b/>
-          <w:color w:val="111827"/>
-          <w:sz w:val="21"/>
+          <w:sz w:val="20"/>
         </w:rPr>
         <w:t>EDUCATION &amp; VERIFIED CERTIFICATIONS</w:t>
       </w:r>
@@ -620,14 +545,14 @@
       <w:r>
         <w:rPr>
           <w:b/>
-          <w:sz w:val="18"/>
+          <w:sz w:val="17"/>
         </w:rPr>
         <w:t>Bachelor of Engineering (B.E.) in Computer Science &amp; Engineering (AI &amp; ML)</w:t>
         <w:br/>
       </w:r>
       <w:r>
         <w:rPr>
-          <w:sz w:val="17"/>
+          <w:sz w:val="16"/>
         </w:rPr>
         <w:t>Sahyadri College of Engineering &amp; Management (SCEM), Mangaluru, Karnataka, India</w:t>
       </w:r>
@@ -635,45 +560,45 @@
     <w:p>
       <w:pPr>
         <w:pStyle w:val="ListBullet"/>
-        <w:spacing w:before="30" w:after="30"/>
+        <w:spacing w:before="20" w:after="20"/>
       </w:pPr>
       <w:r>
         <w:rPr>
           <w:color w:val="374151"/>
-          <w:sz w:val="17"/>
+          <w:sz w:val="16"/>
         </w:rPr>
-        <w:t>JPMorgan Chase &amp; Co. — Distributed Streaming &amp; Software Engineering Simulation (Kafka, REST Controller Architecture, Low-Latency Processing)</w:t>
+        <w:t>JPMorgan Chase &amp; Co. — Distributed Streaming &amp; Software Engineering Simulation (Kafka, REST)</w:t>
       </w:r>
     </w:p>
     <w:p>
       <w:pPr>
         <w:pStyle w:val="ListBullet"/>
-        <w:spacing w:before="30" w:after="30"/>
+        <w:spacing w:before="20" w:after="20"/>
       </w:pPr>
       <w:r>
         <w:rPr>
           <w:color w:val="374151"/>
-          <w:sz w:val="17"/>
+          <w:sz w:val="16"/>
         </w:rPr>
-        <w:t>Deloitte Australia — Cybersecurity Defense &amp; Enterprise Threat Modeling Simulation (Perimeter Defense, Access Control Governance, Incident Response)</w:t>
+        <w:t>Deloitte Australia — Cybersecurity Defense &amp; Enterprise Threat Modeling Simulation</w:t>
       </w:r>
     </w:p>
     <w:p>
       <w:pPr>
         <w:pStyle w:val="ListBullet"/>
-        <w:spacing w:before="30" w:after="30"/>
+        <w:spacing w:before="20" w:after="20"/>
       </w:pPr>
       <w:r>
         <w:rPr>
           <w:color w:val="374151"/>
-          <w:sz w:val="17"/>
+          <w:sz w:val="16"/>
         </w:rPr>
         <w:t>Blackmagic Design — DaVinci Resolve Color Science &amp; Visual Computing Integration</w:t>
       </w:r>
     </w:p>
     <w:sectPr>
       <w:pgSz w:w="12240" w:h="15840"/>
-      <w:pgMar w:top="720" w:right="720" w:bottom="720" w:left="720" w:header="720" w:footer="720" w:gutter="0"/>
+      <w:pgMar w:top="648" w:right="648" w:bottom="648" w:left="648" w:header="720" w:footer="720" w:gutter="0"/>
       <w:cols w:space="720"/>
       <w:docGrid w:linePitch="360"/>
     </w:sectPr>

</xml_diff>